<commit_message>
stworzenie zamka na kody
</commit_message>
<xml_diff>
--- a/dokumentacja.docx.docx
+++ b/dokumentacja.docx.docx
@@ -65,6 +65,18 @@
     <w:p>
       <w:r>
         <w:t>Zgadnij szyfr</w:t>
+      </w:r>
+    </w:p>
+    <w:p/>
+    <w:p>
+      <w:r>
+        <w:t>04.06.2026</w:t>
+      </w:r>
+    </w:p>
+    <w:p/>
+    <w:p>
+      <w:r>
+        <w:t>Napisanie tablicy z zamkiem z hasłami</w:t>
       </w:r>
     </w:p>
     <w:p/>
@@ -526,7 +538,7 @@
   <a:extraClrSchemeLst/>
   <a:extLst>
     <a:ext uri="{05A4C25C-085E-4340-85A3-A5531E510DB2}">
-      <thm15:themeFamily xmlns:thm15="http://schemas.microsoft.com/office/thememl/2012/main" xmlns="" name="Office Theme" id="{62F939B6-93AF-4DB8-9C6B-D6C7DFDC589F}" vid="{4A3C46E8-61CC-4603-A589-7422A47A8E4A}"/>
+      <thm15:themeFamily xmlns="" xmlns:thm15="http://schemas.microsoft.com/office/thememl/2012/main" name="Office Theme" id="{62F939B6-93AF-4DB8-9C6B-D6C7DFDC589F}" vid="{4A3C46E8-61CC-4603-A589-7422A47A8E4A}"/>
     </a:ext>
   </a:extLst>
 </a:theme>

</xml_diff>